<commit_message>
Add code and output screenshots to exp10 report
Co-Authored-By: Claude Sonnet 5.5 <noreply@anthropic.com>
Claude-Session: https://claude.ai/code/session_016SB3aeDTeVz6n2LB31pe7Y
</commit_message>
<xml_diff>
--- a/os_exp10/EXP10_B106.docx
+++ b/os_exp10/EXP10_B106.docx
@@ -398,6 +398,47 @@
       </w:r>
     </w:p>
     <w:p>
+      <w:r>
+        <w:t>Screenshot of the code (IDLE):</w:t>
+      </w:r>
+    </w:p>
+    <w:p>
+      <w:r>
+        <w:drawing>
+          <wp:inline xmlns:a="http://schemas.openxmlformats.org/drawingml/2006/main" xmlns:pic="http://schemas.openxmlformats.org/drawingml/2006/picture">
+            <wp:extent cx="5486400" cy="4356202"/>
+            <wp:docPr id="1" name="Picture 1"/>
+            <wp:cNvGraphicFramePr>
+              <a:graphicFrameLocks noChangeAspect="1"/>
+            </wp:cNvGraphicFramePr>
+            <a:graphic>
+              <a:graphicData uri="http://schemas.openxmlformats.org/drawingml/2006/picture">
+                <pic:pic>
+                  <pic:nvPicPr>
+                    <pic:cNvPr id="0" name="code.png"/>
+                    <pic:cNvPicPr/>
+                  </pic:nvPicPr>
+                  <pic:blipFill>
+                    <a:blip r:embed="rId9"/>
+                    <a:stretch>
+                      <a:fillRect/>
+                    </a:stretch>
+                  </pic:blipFill>
+                  <pic:spPr>
+                    <a:xfrm>
+                      <a:off x="0" y="0"/>
+                      <a:ext cx="5486400" cy="4356202"/>
+                    </a:xfrm>
+                    <a:prstGeom prst="rect"/>
+                  </pic:spPr>
+                </pic:pic>
+              </a:graphicData>
+            </a:graphic>
+          </wp:inline>
+        </w:drawing>
+      </w:r>
+    </w:p>
+    <w:p>
       <w:pPr>
         <w:pStyle w:val="Heading3"/>
       </w:pPr>
@@ -453,6 +494,47 @@
         <w:br/>
         <w:t>Least head movement: C-LOOK = 157</w:t>
         <w:br/>
+      </w:r>
+    </w:p>
+    <w:p>
+      <w:r>
+        <w:t>Screenshot of the output (IDLE Shell):</w:t>
+      </w:r>
+    </w:p>
+    <w:p>
+      <w:r>
+        <w:drawing>
+          <wp:inline xmlns:a="http://schemas.openxmlformats.org/drawingml/2006/main" xmlns:pic="http://schemas.openxmlformats.org/drawingml/2006/picture">
+            <wp:extent cx="5486400" cy="3982514"/>
+            <wp:docPr id="2" name="Picture 2"/>
+            <wp:cNvGraphicFramePr>
+              <a:graphicFrameLocks noChangeAspect="1"/>
+            </wp:cNvGraphicFramePr>
+            <a:graphic>
+              <a:graphicData uri="http://schemas.openxmlformats.org/drawingml/2006/picture">
+                <pic:pic>
+                  <pic:nvPicPr>
+                    <pic:cNvPr id="0" name="2.png"/>
+                    <pic:cNvPicPr/>
+                  </pic:nvPicPr>
+                  <pic:blipFill>
+                    <a:blip r:embed="rId10"/>
+                    <a:stretch>
+                      <a:fillRect/>
+                    </a:stretch>
+                  </pic:blipFill>
+                  <pic:spPr>
+                    <a:xfrm>
+                      <a:off x="0" y="0"/>
+                      <a:ext cx="5486400" cy="3982514"/>
+                    </a:xfrm>
+                    <a:prstGeom prst="rect"/>
+                  </pic:spPr>
+                </pic:pic>
+              </a:graphicData>
+            </a:graphic>
+          </wp:inline>
+        </w:drawing>
       </w:r>
     </w:p>
     <w:p>

</xml_diff>